<commit_message>
Mod: corretti alcuni test cases nel test plan
</commit_message>
<xml_diff>
--- a/Workspace/Testing/Test plan/punti singoli/Tabelle per il test case senza esempi.docx
+++ b/Workspace/Testing/Test plan/punti singoli/Tabelle per il test case senza esempi.docx
@@ -264,7 +264,6 @@
             <w:pPr>
               <w:spacing w:after="160" w:line="259" w:lineRule="auto"/>
             </w:pPr>
-            <w:proofErr w:type="spellStart"/>
             <w:r>
               <w:rPr>
                 <w:b/>
@@ -272,7 +271,6 @@
               </w:rPr>
               <w:t>Error</w:t>
             </w:r>
-            <w:proofErr w:type="spellEnd"/>
             <w:r>
               <w:t xml:space="preserve">: "Username o password non corrette" </w:t>
             </w:r>
@@ -349,7 +347,6 @@
             <w:pPr>
               <w:spacing w:after="160" w:line="259" w:lineRule="auto"/>
             </w:pPr>
-            <w:proofErr w:type="spellStart"/>
             <w:r>
               <w:rPr>
                 <w:b/>
@@ -357,7 +354,6 @@
               </w:rPr>
               <w:t>Error</w:t>
             </w:r>
-            <w:proofErr w:type="spellEnd"/>
             <w:r>
               <w:t xml:space="preserve">: "Username o password non corrette" </w:t>
             </w:r>
@@ -406,7 +402,6 @@
             <w:pPr>
               <w:spacing w:after="160" w:line="259" w:lineRule="auto"/>
             </w:pPr>
-            <w:proofErr w:type="spellStart"/>
             <w:r>
               <w:rPr>
                 <w:b/>
@@ -414,7 +409,6 @@
               </w:rPr>
               <w:t>Null</w:t>
             </w:r>
-            <w:proofErr w:type="spellEnd"/>
           </w:p>
         </w:tc>
         <w:tc>
@@ -440,7 +434,6 @@
             <w:pPr>
               <w:spacing w:after="160" w:line="259" w:lineRule="auto"/>
             </w:pPr>
-            <w:proofErr w:type="spellStart"/>
             <w:r>
               <w:rPr>
                 <w:b/>
@@ -448,7 +441,6 @@
               </w:rPr>
               <w:t>Error</w:t>
             </w:r>
-            <w:proofErr w:type="spellEnd"/>
             <w:r>
               <w:t xml:space="preserve">: "Il campo e-mail è obbligatorio" </w:t>
             </w:r>
@@ -511,7 +503,6 @@
             <w:pPr>
               <w:spacing w:after="160" w:line="259" w:lineRule="auto"/>
             </w:pPr>
-            <w:proofErr w:type="spellStart"/>
             <w:r>
               <w:rPr>
                 <w:b/>
@@ -519,19 +510,17 @@
               </w:rPr>
               <w:t>Null</w:t>
             </w:r>
-            <w:proofErr w:type="spellEnd"/>
-          </w:p>
-        </w:tc>
-        <w:tc>
-          <w:tcPr>
-            <w:tcW w:w="0" w:type="auto"/>
-            <w:hideMark/>
-          </w:tcPr>
-          <w:p>
-            <w:pPr>
-              <w:spacing w:after="160" w:line="259" w:lineRule="auto"/>
-            </w:pPr>
-            <w:proofErr w:type="spellStart"/>
+          </w:p>
+        </w:tc>
+        <w:tc>
+          <w:tcPr>
+            <w:tcW w:w="0" w:type="auto"/>
+            <w:hideMark/>
+          </w:tcPr>
+          <w:p>
+            <w:pPr>
+              <w:spacing w:after="160" w:line="259" w:lineRule="auto"/>
+            </w:pPr>
             <w:r>
               <w:rPr>
                 <w:b/>
@@ -539,7 +528,6 @@
               </w:rPr>
               <w:t>Error</w:t>
             </w:r>
-            <w:proofErr w:type="spellEnd"/>
             <w:r>
               <w:t xml:space="preserve">: "Il campo password è obbligatorio" </w:t>
             </w:r>
@@ -609,7 +597,6 @@
             <w:pPr>
               <w:spacing w:after="160" w:line="259" w:lineRule="auto"/>
             </w:pPr>
-            <w:proofErr w:type="spellStart"/>
             <w:r>
               <w:rPr>
                 <w:b/>
@@ -617,7 +604,6 @@
               </w:rPr>
               <w:t>Error</w:t>
             </w:r>
-            <w:proofErr w:type="spellEnd"/>
             <w:r>
               <w:t>: "Il formato e-mail non valido"</w:t>
             </w:r>
@@ -859,7 +845,6 @@
             <w:r>
               <w:t xml:space="preserve">: Password aggiornata e </w:t>
             </w:r>
-            <w:proofErr w:type="spellStart"/>
             <w:r>
               <w:rPr>
                 <w:b/>
@@ -867,7 +852,6 @@
               </w:rPr>
               <w:t>redirect</w:t>
             </w:r>
-            <w:proofErr w:type="spellEnd"/>
             <w:r>
               <w:t xml:space="preserve"> </w:t>
             </w:r>
@@ -958,7 +942,6 @@
             <w:pPr>
               <w:spacing w:after="160" w:line="259" w:lineRule="auto"/>
             </w:pPr>
-            <w:proofErr w:type="spellStart"/>
             <w:r>
               <w:rPr>
                 <w:b/>
@@ -966,7 +949,6 @@
               </w:rPr>
               <w:t>Error</w:t>
             </w:r>
-            <w:proofErr w:type="spellEnd"/>
             <w:r>
               <w:t xml:space="preserve">: "Password attuale errata" </w:t>
             </w:r>
@@ -1057,7 +1039,6 @@
             <w:pPr>
               <w:spacing w:after="160" w:line="259" w:lineRule="auto"/>
             </w:pPr>
-            <w:proofErr w:type="spellStart"/>
             <w:r>
               <w:rPr>
                 <w:b/>
@@ -1065,7 +1046,6 @@
               </w:rPr>
               <w:t>Error</w:t>
             </w:r>
-            <w:proofErr w:type="spellEnd"/>
             <w:r>
               <w:t>: "Le nuova password inserite non coincidono"</w:t>
             </w:r>
@@ -1156,7 +1136,6 @@
             <w:pPr>
               <w:spacing w:after="160" w:line="259" w:lineRule="auto"/>
             </w:pPr>
-            <w:proofErr w:type="spellStart"/>
             <w:r>
               <w:rPr>
                 <w:b/>
@@ -1164,7 +1143,6 @@
               </w:rPr>
               <w:t>Error</w:t>
             </w:r>
-            <w:proofErr w:type="spellEnd"/>
             <w:r>
               <w:t xml:space="preserve">: "La nuova password non è sufficientemente sicura" </w:t>
             </w:r>
@@ -1248,7 +1226,6 @@
             <w:pPr>
               <w:spacing w:after="160" w:line="259" w:lineRule="auto"/>
             </w:pPr>
-            <w:proofErr w:type="spellStart"/>
             <w:r>
               <w:rPr>
                 <w:b/>
@@ -1256,7 +1233,6 @@
               </w:rPr>
               <w:t>Error</w:t>
             </w:r>
-            <w:proofErr w:type="spellEnd"/>
             <w:r>
               <w:t>: "Il campo 'password attuale' è obbligatorio"</w:t>
             </w:r>
@@ -1574,21 +1550,7 @@
               <w:rPr>
                 <w:lang w:val="en-GB"/>
               </w:rPr>
-              <w:t xml:space="preserve"> </w:t>
-            </w:r>
-            <w:proofErr w:type="spellStart"/>
-            <w:r>
-              <w:rPr>
-                <w:lang w:val="en-GB"/>
-              </w:rPr>
-              <w:t>creato</w:t>
-            </w:r>
-            <w:proofErr w:type="spellEnd"/>
-            <w:r>
-              <w:rPr>
-                <w:lang w:val="en-GB"/>
-              </w:rPr>
-              <w:t xml:space="preserve">, </w:t>
+              <w:t xml:space="preserve"> creato, </w:t>
             </w:r>
             <w:r>
               <w:rPr>
@@ -1776,21 +1738,7 @@
               <w:rPr>
                 <w:lang w:val="en-GB"/>
               </w:rPr>
-              <w:t xml:space="preserve"> </w:t>
-            </w:r>
-            <w:proofErr w:type="spellStart"/>
-            <w:r>
-              <w:rPr>
-                <w:lang w:val="en-GB"/>
-              </w:rPr>
-              <w:t>salvati</w:t>
-            </w:r>
-            <w:proofErr w:type="spellEnd"/>
-            <w:r>
-              <w:rPr>
-                <w:lang w:val="en-GB"/>
-              </w:rPr>
-              <w:t xml:space="preserve"> </w:t>
+              <w:t xml:space="preserve"> salvati </w:t>
             </w:r>
           </w:p>
         </w:tc>
@@ -1907,7 +1855,6 @@
             <w:pPr>
               <w:spacing w:after="160" w:line="259" w:lineRule="auto"/>
             </w:pPr>
-            <w:proofErr w:type="spellStart"/>
             <w:r>
               <w:rPr>
                 <w:b/>
@@ -1915,17 +1862,8 @@
               </w:rPr>
               <w:t>Error</w:t>
             </w:r>
-            <w:proofErr w:type="spellEnd"/>
-            <w:r>
-              <w:t>: "Il campo '</w:t>
-            </w:r>
-            <w:proofErr w:type="spellStart"/>
-            <w:r>
-              <w:t>Titolo'</w:t>
-            </w:r>
-            <w:proofErr w:type="spellEnd"/>
-            <w:r>
-              <w:t xml:space="preserve"> è obbligatorio" </w:t>
+            <w:r>
+              <w:t xml:space="preserve">: "Il campo 'Titolo' è obbligatorio" </w:t>
             </w:r>
           </w:p>
         </w:tc>
@@ -2042,7 +1980,6 @@
             <w:pPr>
               <w:spacing w:after="160" w:line="259" w:lineRule="auto"/>
             </w:pPr>
-            <w:proofErr w:type="spellStart"/>
             <w:r>
               <w:rPr>
                 <w:b/>
@@ -2050,7 +1987,6 @@
               </w:rPr>
               <w:t>Error</w:t>
             </w:r>
-            <w:proofErr w:type="spellEnd"/>
             <w:r>
               <w:t xml:space="preserve">: "Per favore scegliere un dipendente" </w:t>
             </w:r>
@@ -2169,7 +2105,6 @@
             <w:pPr>
               <w:spacing w:after="160" w:line="259" w:lineRule="auto"/>
             </w:pPr>
-            <w:proofErr w:type="spellStart"/>
             <w:r>
               <w:rPr>
                 <w:b/>
@@ -2177,7 +2112,6 @@
               </w:rPr>
               <w:t>Error</w:t>
             </w:r>
-            <w:proofErr w:type="spellEnd"/>
             <w:r>
               <w:t xml:space="preserve">: "Data di scadenza obbligatoria e in formato valido" </w:t>
             </w:r>
@@ -2296,7 +2230,6 @@
             <w:pPr>
               <w:spacing w:after="160" w:line="259" w:lineRule="auto"/>
             </w:pPr>
-            <w:proofErr w:type="spellStart"/>
             <w:r>
               <w:rPr>
                 <w:b/>
@@ -2304,7 +2237,6 @@
               </w:rPr>
               <w:t>Error</w:t>
             </w:r>
-            <w:proofErr w:type="spellEnd"/>
             <w:r>
               <w:t>: "Inserire istruzioni (min. 10</w:t>
             </w:r>
@@ -2435,7 +2367,6 @@
             <w:pPr>
               <w:spacing w:after="160" w:line="259" w:lineRule="auto"/>
             </w:pPr>
-            <w:proofErr w:type="spellStart"/>
             <w:r>
               <w:rPr>
                 <w:b/>
@@ -2443,9 +2374,14 @@
               </w:rPr>
               <w:t>Error</w:t>
             </w:r>
-            <w:proofErr w:type="spellEnd"/>
-            <w:r>
-              <w:t xml:space="preserve">: "Inserito file non consentito" </w:t>
+            <w:r>
+              <w:t>: "</w:t>
+            </w:r>
+            <w:r>
+              <w:t>Estensione file non consentita</w:t>
+            </w:r>
+            <w:r>
+              <w:t xml:space="preserve">" </w:t>
             </w:r>
           </w:p>
         </w:tc>
@@ -2562,7 +2498,6 @@
             <w:pPr>
               <w:spacing w:after="160" w:line="259" w:lineRule="auto"/>
             </w:pPr>
-            <w:proofErr w:type="spellStart"/>
             <w:r>
               <w:rPr>
                 <w:b/>
@@ -2570,7 +2505,6 @@
               </w:rPr>
               <w:t>Error</w:t>
             </w:r>
-            <w:proofErr w:type="spellEnd"/>
             <w:r>
               <w:t xml:space="preserve">: "Il file supera la dimensione massima" </w:t>
             </w:r>
@@ -2588,11 +2522,9 @@
           <w:numId w:val="1"/>
         </w:numPr>
       </w:pPr>
-      <w:proofErr w:type="spellStart"/>
       <w:r>
         <w:t>HoldTask</w:t>
       </w:r>
-      <w:proofErr w:type="spellEnd"/>
     </w:p>
     <w:tbl>
       <w:tblPr>
@@ -2840,7 +2772,6 @@
             <w:pPr>
               <w:spacing w:after="160" w:line="259" w:lineRule="auto"/>
             </w:pPr>
-            <w:proofErr w:type="spellStart"/>
             <w:r>
               <w:rPr>
                 <w:b/>
@@ -2848,7 +2779,6 @@
               </w:rPr>
               <w:t>Error</w:t>
             </w:r>
-            <w:proofErr w:type="spellEnd"/>
             <w:r>
               <w:t>: "È obbligatorio inserire una motivazione... (minimo 10</w:t>
             </w:r>
@@ -2924,7 +2854,6 @@
             <w:pPr>
               <w:spacing w:after="160" w:line="259" w:lineRule="auto"/>
             </w:pPr>
-            <w:proofErr w:type="spellStart"/>
             <w:r>
               <w:rPr>
                 <w:b/>
@@ -2932,7 +2861,6 @@
               </w:rPr>
               <w:t>Error</w:t>
             </w:r>
-            <w:proofErr w:type="spellEnd"/>
             <w:r>
               <w:t>: possibilità di sospendere il task non disponibile</w:t>
             </w:r>
@@ -3002,7 +2930,6 @@
             <w:pPr>
               <w:spacing w:after="160" w:line="259" w:lineRule="auto"/>
             </w:pPr>
-            <w:proofErr w:type="spellStart"/>
             <w:r>
               <w:rPr>
                 <w:b/>
@@ -3010,7 +2937,6 @@
               </w:rPr>
               <w:t>Error</w:t>
             </w:r>
-            <w:proofErr w:type="spellEnd"/>
             <w:r>
               <w:rPr>
                 <w:b/>
@@ -3089,7 +3015,6 @@
             <w:pPr>
               <w:spacing w:after="160" w:line="259" w:lineRule="auto"/>
             </w:pPr>
-            <w:proofErr w:type="spellStart"/>
             <w:r>
               <w:rPr>
                 <w:b/>
@@ -3097,7 +3022,6 @@
               </w:rPr>
               <w:t>Error</w:t>
             </w:r>
-            <w:proofErr w:type="spellEnd"/>
             <w:r>
               <w:t>:</w:t>
             </w:r>
@@ -3152,7 +3076,6 @@
             <w:pPr>
               <w:spacing w:after="160" w:line="259" w:lineRule="auto"/>
             </w:pPr>
-            <w:proofErr w:type="spellStart"/>
             <w:r>
               <w:rPr>
                 <w:b/>
@@ -3160,19 +3083,17 @@
               </w:rPr>
               <w:t>Null</w:t>
             </w:r>
-            <w:proofErr w:type="spellEnd"/>
-          </w:p>
-        </w:tc>
-        <w:tc>
-          <w:tcPr>
-            <w:tcW w:w="0" w:type="auto"/>
-            <w:hideMark/>
-          </w:tcPr>
-          <w:p>
-            <w:pPr>
-              <w:spacing w:after="160" w:line="259" w:lineRule="auto"/>
-            </w:pPr>
-            <w:proofErr w:type="spellStart"/>
+          </w:p>
+        </w:tc>
+        <w:tc>
+          <w:tcPr>
+            <w:tcW w:w="0" w:type="auto"/>
+            <w:hideMark/>
+          </w:tcPr>
+          <w:p>
+            <w:pPr>
+              <w:spacing w:after="160" w:line="259" w:lineRule="auto"/>
+            </w:pPr>
             <w:r>
               <w:rPr>
                 <w:b/>
@@ -3180,7 +3101,6 @@
               </w:rPr>
               <w:t>Error</w:t>
             </w:r>
-            <w:proofErr w:type="spellEnd"/>
             <w:r>
               <w:t xml:space="preserve">: Motivazione obbligatoria </w:t>
             </w:r>
@@ -3609,7 +3529,6 @@
             <w:pPr>
               <w:spacing w:after="160" w:line="259" w:lineRule="auto"/>
             </w:pPr>
-            <w:proofErr w:type="spellStart"/>
             <w:r>
               <w:rPr>
                 <w:b/>
@@ -3617,7 +3536,6 @@
               </w:rPr>
               <w:t>Error</w:t>
             </w:r>
-            <w:proofErr w:type="spellEnd"/>
             <w:r>
               <w:t xml:space="preserve">: "Indirizzo e-mail già utilizzato" </w:t>
             </w:r>
@@ -3739,7 +3657,6 @@
             <w:pPr>
               <w:spacing w:after="160" w:line="259" w:lineRule="auto"/>
             </w:pPr>
-            <w:proofErr w:type="spellStart"/>
             <w:r>
               <w:rPr>
                 <w:b/>
@@ -3747,7 +3664,6 @@
               </w:rPr>
               <w:t>Error</w:t>
             </w:r>
-            <w:proofErr w:type="spellEnd"/>
             <w:r>
               <w:t>: "Il campo 'nome' è obbligatorio"</w:t>
             </w:r>
@@ -3869,7 +3785,6 @@
             <w:pPr>
               <w:spacing w:after="160" w:line="259" w:lineRule="auto"/>
             </w:pPr>
-            <w:proofErr w:type="spellStart"/>
             <w:r>
               <w:rPr>
                 <w:b/>
@@ -3877,7 +3792,6 @@
               </w:rPr>
               <w:t>Error</w:t>
             </w:r>
-            <w:proofErr w:type="spellEnd"/>
             <w:r>
               <w:t xml:space="preserve">: "Formato data non valido" </w:t>
             </w:r>
@@ -3999,7 +3913,6 @@
             <w:pPr>
               <w:spacing w:after="160" w:line="259" w:lineRule="auto"/>
             </w:pPr>
-            <w:proofErr w:type="spellStart"/>
             <w:r>
               <w:rPr>
                 <w:b/>
@@ -4007,17 +3920,8 @@
               </w:rPr>
               <w:t>Error</w:t>
             </w:r>
-            <w:proofErr w:type="spellEnd"/>
-            <w:r>
-              <w:t xml:space="preserve">: "Il campo 'data di </w:t>
-            </w:r>
-            <w:proofErr w:type="spellStart"/>
-            <w:r>
-              <w:t>nascita'</w:t>
-            </w:r>
-            <w:proofErr w:type="spellEnd"/>
-            <w:r>
-              <w:t xml:space="preserve"> è obbligatorio" </w:t>
+            <w:r>
+              <w:t xml:space="preserve">: "Il campo 'data di nascita' è obbligatorio" </w:t>
             </w:r>
           </w:p>
         </w:tc>
@@ -4137,7 +4041,6 @@
             <w:pPr>
               <w:spacing w:after="160" w:line="259" w:lineRule="auto"/>
             </w:pPr>
-            <w:proofErr w:type="spellStart"/>
             <w:r>
               <w:rPr>
                 <w:b/>
@@ -4145,7 +4048,6 @@
               </w:rPr>
               <w:t>Error</w:t>
             </w:r>
-            <w:proofErr w:type="spellEnd"/>
             <w:r>
               <w:t xml:space="preserve">: "Il formato e-mail non valido" </w:t>
             </w:r>
@@ -4270,7 +4172,6 @@
             <w:pPr>
               <w:spacing w:after="160" w:line="259" w:lineRule="auto"/>
             </w:pPr>
-            <w:proofErr w:type="spellStart"/>
             <w:r>
               <w:rPr>
                 <w:b/>
@@ -4278,7 +4179,6 @@
               </w:rPr>
               <w:t>Error</w:t>
             </w:r>
-            <w:proofErr w:type="spellEnd"/>
             <w:r>
               <w:t>: "</w:t>
             </w:r>
@@ -4379,21 +4279,12 @@
                 <w:bCs/>
               </w:rPr>
             </w:pPr>
-            <w:proofErr w:type="spellStart"/>
-            <w:r>
-              <w:rPr>
-                <w:b/>
-                <w:bCs/>
-              </w:rPr>
-              <w:t>Error</w:t>
-            </w:r>
-            <w:proofErr w:type="spellEnd"/>
-            <w:r>
-              <w:rPr>
-                <w:b/>
-                <w:bCs/>
-              </w:rPr>
-              <w:t xml:space="preserve">: </w:t>
+            <w:r>
+              <w:rPr>
+                <w:b/>
+                <w:bCs/>
+              </w:rPr>
+              <w:t xml:space="preserve">Error: </w:t>
             </w:r>
             <w:r>
               <w:t>“</w:t>
@@ -4486,21 +4377,12 @@
             <w:tcW w:w="2151" w:type="dxa"/>
           </w:tcPr>
           <w:p>
-            <w:proofErr w:type="spellStart"/>
-            <w:r>
-              <w:rPr>
-                <w:b/>
-                <w:bCs/>
-              </w:rPr>
-              <w:t>Error</w:t>
-            </w:r>
-            <w:proofErr w:type="spellEnd"/>
-            <w:r>
-              <w:rPr>
-                <w:b/>
-                <w:bCs/>
-              </w:rPr>
-              <w:t xml:space="preserve">: </w:t>
+            <w:r>
+              <w:rPr>
+                <w:b/>
+                <w:bCs/>
+              </w:rPr>
+              <w:t xml:space="preserve">Error: </w:t>
             </w:r>
             <w:r>
               <w:t>“Campo ‘cognome’ obbligatorio”</w:t>

</xml_diff>

<commit_message>
Mod: correzione ortografica in alcuni test frame
</commit_message>
<xml_diff>
--- a/Workspace/Testing/Test plan/punti singoli/Tabelle per il test case senza esempi.docx
+++ b/Workspace/Testing/Test plan/punti singoli/Tabelle per il test case senza esempi.docx
@@ -264,6 +264,7 @@
             <w:pPr>
               <w:spacing w:after="160" w:line="259" w:lineRule="auto"/>
             </w:pPr>
+            <w:proofErr w:type="spellStart"/>
             <w:r>
               <w:rPr>
                 <w:b/>
@@ -271,6 +272,7 @@
               </w:rPr>
               <w:t>Error</w:t>
             </w:r>
+            <w:proofErr w:type="spellEnd"/>
             <w:r>
               <w:t xml:space="preserve">: "Username o password non corrette" </w:t>
             </w:r>
@@ -347,6 +349,7 @@
             <w:pPr>
               <w:spacing w:after="160" w:line="259" w:lineRule="auto"/>
             </w:pPr>
+            <w:proofErr w:type="spellStart"/>
             <w:r>
               <w:rPr>
                 <w:b/>
@@ -354,6 +357,7 @@
               </w:rPr>
               <w:t>Error</w:t>
             </w:r>
+            <w:proofErr w:type="spellEnd"/>
             <w:r>
               <w:t xml:space="preserve">: "Username o password non corrette" </w:t>
             </w:r>
@@ -434,6 +438,7 @@
             <w:pPr>
               <w:spacing w:after="160" w:line="259" w:lineRule="auto"/>
             </w:pPr>
+            <w:proofErr w:type="spellStart"/>
             <w:r>
               <w:rPr>
                 <w:b/>
@@ -441,6 +446,7 @@
               </w:rPr>
               <w:t>Error</w:t>
             </w:r>
+            <w:proofErr w:type="spellEnd"/>
             <w:r>
               <w:t xml:space="preserve">: "Il campo e-mail è obbligatorio" </w:t>
             </w:r>
@@ -521,6 +527,7 @@
             <w:pPr>
               <w:spacing w:after="160" w:line="259" w:lineRule="auto"/>
             </w:pPr>
+            <w:proofErr w:type="spellStart"/>
             <w:r>
               <w:rPr>
                 <w:b/>
@@ -528,6 +535,7 @@
               </w:rPr>
               <w:t>Error</w:t>
             </w:r>
+            <w:proofErr w:type="spellEnd"/>
             <w:r>
               <w:t xml:space="preserve">: "Il campo password è obbligatorio" </w:t>
             </w:r>
@@ -597,6 +605,7 @@
             <w:pPr>
               <w:spacing w:after="160" w:line="259" w:lineRule="auto"/>
             </w:pPr>
+            <w:proofErr w:type="spellStart"/>
             <w:r>
               <w:rPr>
                 <w:b/>
@@ -604,6 +613,7 @@
               </w:rPr>
               <w:t>Error</w:t>
             </w:r>
+            <w:proofErr w:type="spellEnd"/>
             <w:r>
               <w:t>: "Il formato e-mail non valido"</w:t>
             </w:r>
@@ -845,6 +855,7 @@
             <w:r>
               <w:t xml:space="preserve">: Password aggiornata e </w:t>
             </w:r>
+            <w:proofErr w:type="spellStart"/>
             <w:r>
               <w:rPr>
                 <w:b/>
@@ -852,6 +863,7 @@
               </w:rPr>
               <w:t>redirect</w:t>
             </w:r>
+            <w:proofErr w:type="spellEnd"/>
             <w:r>
               <w:t xml:space="preserve"> </w:t>
             </w:r>
@@ -942,6 +954,7 @@
             <w:pPr>
               <w:spacing w:after="160" w:line="259" w:lineRule="auto"/>
             </w:pPr>
+            <w:proofErr w:type="spellStart"/>
             <w:r>
               <w:rPr>
                 <w:b/>
@@ -949,6 +962,7 @@
               </w:rPr>
               <w:t>Error</w:t>
             </w:r>
+            <w:proofErr w:type="spellEnd"/>
             <w:r>
               <w:t xml:space="preserve">: "Password attuale errata" </w:t>
             </w:r>
@@ -1039,6 +1053,7 @@
             <w:pPr>
               <w:spacing w:after="160" w:line="259" w:lineRule="auto"/>
             </w:pPr>
+            <w:proofErr w:type="spellStart"/>
             <w:r>
               <w:rPr>
                 <w:b/>
@@ -1046,6 +1061,7 @@
               </w:rPr>
               <w:t>Error</w:t>
             </w:r>
+            <w:proofErr w:type="spellEnd"/>
             <w:r>
               <w:t>: "Le nuova password inserite non coincidono"</w:t>
             </w:r>
@@ -1136,6 +1152,7 @@
             <w:pPr>
               <w:spacing w:after="160" w:line="259" w:lineRule="auto"/>
             </w:pPr>
+            <w:proofErr w:type="spellStart"/>
             <w:r>
               <w:rPr>
                 <w:b/>
@@ -1143,6 +1160,7 @@
               </w:rPr>
               <w:t>Error</w:t>
             </w:r>
+            <w:proofErr w:type="spellEnd"/>
             <w:r>
               <w:t xml:space="preserve">: "La nuova password non è sufficientemente sicura" </w:t>
             </w:r>
@@ -1226,6 +1244,7 @@
             <w:pPr>
               <w:spacing w:after="160" w:line="259" w:lineRule="auto"/>
             </w:pPr>
+            <w:proofErr w:type="spellStart"/>
             <w:r>
               <w:rPr>
                 <w:b/>
@@ -1233,6 +1252,7 @@
               </w:rPr>
               <w:t>Error</w:t>
             </w:r>
+            <w:proofErr w:type="spellEnd"/>
             <w:r>
               <w:t>: "Il campo 'password attuale' è obbligatorio"</w:t>
             </w:r>
@@ -1550,7 +1570,21 @@
               <w:rPr>
                 <w:lang w:val="en-GB"/>
               </w:rPr>
-              <w:t xml:space="preserve"> creato, </w:t>
+              <w:t xml:space="preserve"> </w:t>
+            </w:r>
+            <w:proofErr w:type="spellStart"/>
+            <w:r>
+              <w:rPr>
+                <w:lang w:val="en-GB"/>
+              </w:rPr>
+              <w:t>creato</w:t>
+            </w:r>
+            <w:proofErr w:type="spellEnd"/>
+            <w:r>
+              <w:rPr>
+                <w:lang w:val="en-GB"/>
+              </w:rPr>
+              <w:t xml:space="preserve">, </w:t>
             </w:r>
             <w:r>
               <w:rPr>
@@ -1738,7 +1772,21 @@
               <w:rPr>
                 <w:lang w:val="en-GB"/>
               </w:rPr>
-              <w:t xml:space="preserve"> salvati </w:t>
+              <w:t xml:space="preserve"> </w:t>
+            </w:r>
+            <w:proofErr w:type="spellStart"/>
+            <w:r>
+              <w:rPr>
+                <w:lang w:val="en-GB"/>
+              </w:rPr>
+              <w:t>salvati</w:t>
+            </w:r>
+            <w:proofErr w:type="spellEnd"/>
+            <w:r>
+              <w:rPr>
+                <w:lang w:val="en-GB"/>
+              </w:rPr>
+              <w:t xml:space="preserve"> </w:t>
             </w:r>
           </w:p>
         </w:tc>
@@ -1855,6 +1903,7 @@
             <w:pPr>
               <w:spacing w:after="160" w:line="259" w:lineRule="auto"/>
             </w:pPr>
+            <w:proofErr w:type="spellStart"/>
             <w:r>
               <w:rPr>
                 <w:b/>
@@ -1862,8 +1911,17 @@
               </w:rPr>
               <w:t>Error</w:t>
             </w:r>
-            <w:r>
-              <w:t xml:space="preserve">: "Il campo 'Titolo' è obbligatorio" </w:t>
+            <w:proofErr w:type="spellEnd"/>
+            <w:r>
+              <w:t>: "Il campo '</w:t>
+            </w:r>
+            <w:proofErr w:type="spellStart"/>
+            <w:r>
+              <w:t>Titolo'</w:t>
+            </w:r>
+            <w:proofErr w:type="spellEnd"/>
+            <w:r>
+              <w:t xml:space="preserve"> è obbligatorio" </w:t>
             </w:r>
           </w:p>
         </w:tc>
@@ -1980,6 +2038,7 @@
             <w:pPr>
               <w:spacing w:after="160" w:line="259" w:lineRule="auto"/>
             </w:pPr>
+            <w:proofErr w:type="spellStart"/>
             <w:r>
               <w:rPr>
                 <w:b/>
@@ -1987,6 +2046,7 @@
               </w:rPr>
               <w:t>Error</w:t>
             </w:r>
+            <w:proofErr w:type="spellEnd"/>
             <w:r>
               <w:t xml:space="preserve">: "Per favore scegliere un dipendente" </w:t>
             </w:r>
@@ -2105,6 +2165,7 @@
             <w:pPr>
               <w:spacing w:after="160" w:line="259" w:lineRule="auto"/>
             </w:pPr>
+            <w:proofErr w:type="spellStart"/>
             <w:r>
               <w:rPr>
                 <w:b/>
@@ -2112,6 +2173,7 @@
               </w:rPr>
               <w:t>Error</w:t>
             </w:r>
+            <w:proofErr w:type="spellEnd"/>
             <w:r>
               <w:t xml:space="preserve">: "Data di scadenza obbligatoria e in formato valido" </w:t>
             </w:r>
@@ -2230,6 +2292,7 @@
             <w:pPr>
               <w:spacing w:after="160" w:line="259" w:lineRule="auto"/>
             </w:pPr>
+            <w:proofErr w:type="spellStart"/>
             <w:r>
               <w:rPr>
                 <w:b/>
@@ -2237,6 +2300,7 @@
               </w:rPr>
               <w:t>Error</w:t>
             </w:r>
+            <w:proofErr w:type="spellEnd"/>
             <w:r>
               <w:t>: "Inserire istruzioni (min. 10</w:t>
             </w:r>
@@ -2367,6 +2431,7 @@
             <w:pPr>
               <w:spacing w:after="160" w:line="259" w:lineRule="auto"/>
             </w:pPr>
+            <w:proofErr w:type="spellStart"/>
             <w:r>
               <w:rPr>
                 <w:b/>
@@ -2374,6 +2439,7 @@
               </w:rPr>
               <w:t>Error</w:t>
             </w:r>
+            <w:proofErr w:type="spellEnd"/>
             <w:r>
               <w:t>: "</w:t>
             </w:r>
@@ -2498,6 +2564,7 @@
             <w:pPr>
               <w:spacing w:after="160" w:line="259" w:lineRule="auto"/>
             </w:pPr>
+            <w:proofErr w:type="spellStart"/>
             <w:r>
               <w:rPr>
                 <w:b/>
@@ -2505,6 +2572,7 @@
               </w:rPr>
               <w:t>Error</w:t>
             </w:r>
+            <w:proofErr w:type="spellEnd"/>
             <w:r>
               <w:t xml:space="preserve">: "Il file supera la dimensione massima" </w:t>
             </w:r>
@@ -2522,9 +2590,11 @@
           <w:numId w:val="1"/>
         </w:numPr>
       </w:pPr>
+      <w:proofErr w:type="spellStart"/>
       <w:r>
         <w:t>HoldTask</w:t>
       </w:r>
+      <w:proofErr w:type="spellEnd"/>
     </w:p>
     <w:tbl>
       <w:tblPr>
@@ -2772,6 +2842,7 @@
             <w:pPr>
               <w:spacing w:after="160" w:line="259" w:lineRule="auto"/>
             </w:pPr>
+            <w:proofErr w:type="spellStart"/>
             <w:r>
               <w:rPr>
                 <w:b/>
@@ -2779,6 +2850,7 @@
               </w:rPr>
               <w:t>Error</w:t>
             </w:r>
+            <w:proofErr w:type="spellEnd"/>
             <w:r>
               <w:t>: "È obbligatorio inserire una motivazione... (minimo 10</w:t>
             </w:r>
@@ -2854,6 +2926,7 @@
             <w:pPr>
               <w:spacing w:after="160" w:line="259" w:lineRule="auto"/>
             </w:pPr>
+            <w:proofErr w:type="spellStart"/>
             <w:r>
               <w:rPr>
                 <w:b/>
@@ -2861,6 +2934,7 @@
               </w:rPr>
               <w:t>Error</w:t>
             </w:r>
+            <w:proofErr w:type="spellEnd"/>
             <w:r>
               <w:t>: possibilità di sospendere il task non disponibile</w:t>
             </w:r>
@@ -2930,6 +3004,7 @@
             <w:pPr>
               <w:spacing w:after="160" w:line="259" w:lineRule="auto"/>
             </w:pPr>
+            <w:proofErr w:type="spellStart"/>
             <w:r>
               <w:rPr>
                 <w:b/>
@@ -2937,6 +3012,7 @@
               </w:rPr>
               <w:t>Error</w:t>
             </w:r>
+            <w:proofErr w:type="spellEnd"/>
             <w:r>
               <w:rPr>
                 <w:b/>
@@ -2974,7 +3050,21 @@
                 <w:bCs/>
               </w:rPr>
               <w:lastRenderedPageBreak/>
-              <w:t>TF_06</w:t>
+              <w:t>TF_</w:t>
+            </w:r>
+            <w:r>
+              <w:rPr>
+                <w:b/>
+                <w:bCs/>
+              </w:rPr>
+              <w:t>4.</w:t>
+            </w:r>
+            <w:r>
+              <w:rPr>
+                <w:b/>
+                <w:bCs/>
+              </w:rPr>
+              <w:t>6</w:t>
             </w:r>
           </w:p>
         </w:tc>
@@ -3015,6 +3105,7 @@
             <w:pPr>
               <w:spacing w:after="160" w:line="259" w:lineRule="auto"/>
             </w:pPr>
+            <w:proofErr w:type="spellStart"/>
             <w:r>
               <w:rPr>
                 <w:b/>
@@ -3022,6 +3113,7 @@
               </w:rPr>
               <w:t>Error</w:t>
             </w:r>
+            <w:proofErr w:type="spellEnd"/>
             <w:r>
               <w:t>:</w:t>
             </w:r>
@@ -3049,7 +3141,21 @@
                 <w:b/>
                 <w:bCs/>
               </w:rPr>
-              <w:t>TF_07</w:t>
+              <w:t>TF_</w:t>
+            </w:r>
+            <w:r>
+              <w:rPr>
+                <w:b/>
+                <w:bCs/>
+              </w:rPr>
+              <w:t>4.</w:t>
+            </w:r>
+            <w:r>
+              <w:rPr>
+                <w:b/>
+                <w:bCs/>
+              </w:rPr>
+              <w:t>7</w:t>
             </w:r>
           </w:p>
         </w:tc>
@@ -3094,6 +3200,7 @@
             <w:pPr>
               <w:spacing w:after="160" w:line="259" w:lineRule="auto"/>
             </w:pPr>
+            <w:proofErr w:type="spellStart"/>
             <w:r>
               <w:rPr>
                 <w:b/>
@@ -3101,6 +3208,7 @@
               </w:rPr>
               <w:t>Error</w:t>
             </w:r>
+            <w:proofErr w:type="spellEnd"/>
             <w:r>
               <w:t xml:space="preserve">: Motivazione obbligatoria </w:t>
             </w:r>
@@ -3529,6 +3637,7 @@
             <w:pPr>
               <w:spacing w:after="160" w:line="259" w:lineRule="auto"/>
             </w:pPr>
+            <w:proofErr w:type="spellStart"/>
             <w:r>
               <w:rPr>
                 <w:b/>
@@ -3536,6 +3645,7 @@
               </w:rPr>
               <w:t>Error</w:t>
             </w:r>
+            <w:proofErr w:type="spellEnd"/>
             <w:r>
               <w:t xml:space="preserve">: "Indirizzo e-mail già utilizzato" </w:t>
             </w:r>
@@ -3657,6 +3767,7 @@
             <w:pPr>
               <w:spacing w:after="160" w:line="259" w:lineRule="auto"/>
             </w:pPr>
+            <w:proofErr w:type="spellStart"/>
             <w:r>
               <w:rPr>
                 <w:b/>
@@ -3664,6 +3775,7 @@
               </w:rPr>
               <w:t>Error</w:t>
             </w:r>
+            <w:proofErr w:type="spellEnd"/>
             <w:r>
               <w:t>: "Il campo 'nome' è obbligatorio"</w:t>
             </w:r>
@@ -3785,6 +3897,7 @@
             <w:pPr>
               <w:spacing w:after="160" w:line="259" w:lineRule="auto"/>
             </w:pPr>
+            <w:proofErr w:type="spellStart"/>
             <w:r>
               <w:rPr>
                 <w:b/>
@@ -3792,6 +3905,7 @@
               </w:rPr>
               <w:t>Error</w:t>
             </w:r>
+            <w:proofErr w:type="spellEnd"/>
             <w:r>
               <w:t xml:space="preserve">: "Formato data non valido" </w:t>
             </w:r>
@@ -3913,6 +4027,7 @@
             <w:pPr>
               <w:spacing w:after="160" w:line="259" w:lineRule="auto"/>
             </w:pPr>
+            <w:proofErr w:type="spellStart"/>
             <w:r>
               <w:rPr>
                 <w:b/>
@@ -3920,8 +4035,17 @@
               </w:rPr>
               <w:t>Error</w:t>
             </w:r>
-            <w:r>
-              <w:t xml:space="preserve">: "Il campo 'data di nascita' è obbligatorio" </w:t>
+            <w:proofErr w:type="spellEnd"/>
+            <w:r>
+              <w:t xml:space="preserve">: "Il campo 'data di </w:t>
+            </w:r>
+            <w:proofErr w:type="spellStart"/>
+            <w:r>
+              <w:t>nascita'</w:t>
+            </w:r>
+            <w:proofErr w:type="spellEnd"/>
+            <w:r>
+              <w:t xml:space="preserve"> è obbligatorio" </w:t>
             </w:r>
           </w:p>
         </w:tc>
@@ -4041,6 +4165,7 @@
             <w:pPr>
               <w:spacing w:after="160" w:line="259" w:lineRule="auto"/>
             </w:pPr>
+            <w:proofErr w:type="spellStart"/>
             <w:r>
               <w:rPr>
                 <w:b/>
@@ -4048,6 +4173,7 @@
               </w:rPr>
               <w:t>Error</w:t>
             </w:r>
+            <w:proofErr w:type="spellEnd"/>
             <w:r>
               <w:t xml:space="preserve">: "Il formato e-mail non valido" </w:t>
             </w:r>
@@ -4172,6 +4298,7 @@
             <w:pPr>
               <w:spacing w:after="160" w:line="259" w:lineRule="auto"/>
             </w:pPr>
+            <w:proofErr w:type="spellStart"/>
             <w:r>
               <w:rPr>
                 <w:b/>
@@ -4179,6 +4306,7 @@
               </w:rPr>
               <w:t>Error</w:t>
             </w:r>
+            <w:proofErr w:type="spellEnd"/>
             <w:r>
               <w:t>: "</w:t>
             </w:r>
@@ -4279,12 +4407,21 @@
                 <w:bCs/>
               </w:rPr>
             </w:pPr>
-            <w:r>
-              <w:rPr>
-                <w:b/>
-                <w:bCs/>
-              </w:rPr>
-              <w:t xml:space="preserve">Error: </w:t>
+            <w:proofErr w:type="spellStart"/>
+            <w:r>
+              <w:rPr>
+                <w:b/>
+                <w:bCs/>
+              </w:rPr>
+              <w:t>Error</w:t>
+            </w:r>
+            <w:proofErr w:type="spellEnd"/>
+            <w:r>
+              <w:rPr>
+                <w:b/>
+                <w:bCs/>
+              </w:rPr>
+              <w:t xml:space="preserve">: </w:t>
             </w:r>
             <w:r>
               <w:t>“</w:t>
@@ -4377,12 +4514,21 @@
             <w:tcW w:w="2151" w:type="dxa"/>
           </w:tcPr>
           <w:p>
-            <w:r>
-              <w:rPr>
-                <w:b/>
-                <w:bCs/>
-              </w:rPr>
-              <w:t xml:space="preserve">Error: </w:t>
+            <w:proofErr w:type="spellStart"/>
+            <w:r>
+              <w:rPr>
+                <w:b/>
+                <w:bCs/>
+              </w:rPr>
+              <w:t>Error</w:t>
+            </w:r>
+            <w:proofErr w:type="spellEnd"/>
+            <w:r>
+              <w:rPr>
+                <w:b/>
+                <w:bCs/>
+              </w:rPr>
+              <w:t xml:space="preserve">: </w:t>
             </w:r>
             <w:r>
               <w:t>“Campo ‘cognome’ obbligatorio”</w:t>

</xml_diff>